<commit_message>
mdag - отчет oop - lab2
</commit_message>
<xml_diff>
--- a/MDAG/lab2/lab2Cascaval_kuhn.docx
+++ b/MDAG/lab2/lab2Cascaval_kuhn.docx
@@ -4,7 +4,6 @@
   <w:body>
     <w:p>
       <w:pPr>
-        <w:widowControl w:val="false"/>
         <w:suppressAutoHyphens w:val="true"/>
         <w:spacing w:before="0" w:after="0" w:line="240"/>
         <w:ind w:right="0" w:left="0" w:firstLine="0"/>
@@ -32,7 +31,6 @@
     </w:p>
     <w:p>
       <w:pPr>
-        <w:widowControl w:val="false"/>
         <w:suppressAutoHyphens w:val="true"/>
         <w:spacing w:before="0" w:after="0" w:line="240"/>
         <w:ind w:right="0" w:left="0" w:firstLine="0"/>
@@ -60,7 +58,6 @@
     </w:p>
     <w:p>
       <w:pPr>
-        <w:widowControl w:val="false"/>
         <w:suppressAutoHyphens w:val="true"/>
         <w:spacing w:before="0" w:after="0" w:line="240"/>
         <w:ind w:right="0" w:left="0" w:firstLine="0"/>
@@ -88,194 +85,182 @@
     </w:p>
     <w:p>
       <w:pPr>
-        <w:widowControl w:val="false"/>
-        <w:suppressAutoHyphens w:val="true"/>
-        <w:spacing w:before="0" w:after="0" w:line="240"/>
-        <w:ind w:right="0" w:left="0" w:firstLine="0"/>
-        <w:jc w:val="center"/>
-        <w:rPr>
-          <w:rFonts w:ascii="Times New Roman" w:hAnsi="Times New Roman" w:cs="Times New Roman" w:eastAsia="Times New Roman"/>
-          <w:color w:val="auto"/>
-          <w:spacing w:val="0"/>
-          <w:position w:val="0"/>
-          <w:sz w:val="32"/>
-          <w:shd w:fill="auto" w:val="clear"/>
-        </w:rPr>
-      </w:pPr>
-    </w:p>
-    <w:p>
-      <w:pPr>
-        <w:widowControl w:val="false"/>
-        <w:suppressAutoHyphens w:val="true"/>
-        <w:spacing w:before="0" w:after="0" w:line="240"/>
-        <w:ind w:right="0" w:left="0" w:firstLine="0"/>
-        <w:jc w:val="center"/>
-        <w:rPr>
-          <w:rFonts w:ascii="Times New Roman" w:hAnsi="Times New Roman" w:cs="Times New Roman" w:eastAsia="Times New Roman"/>
-          <w:color w:val="auto"/>
-          <w:spacing w:val="0"/>
-          <w:position w:val="0"/>
-          <w:sz w:val="32"/>
-          <w:shd w:fill="auto" w:val="clear"/>
-        </w:rPr>
-      </w:pPr>
-    </w:p>
-    <w:p>
-      <w:pPr>
-        <w:widowControl w:val="false"/>
-        <w:suppressAutoHyphens w:val="true"/>
-        <w:spacing w:before="0" w:after="0" w:line="240"/>
-        <w:ind w:right="0" w:left="0" w:firstLine="0"/>
-        <w:jc w:val="center"/>
-        <w:rPr>
-          <w:rFonts w:ascii="Times New Roman" w:hAnsi="Times New Roman" w:cs="Times New Roman" w:eastAsia="Times New Roman"/>
-          <w:color w:val="auto"/>
-          <w:spacing w:val="0"/>
-          <w:position w:val="0"/>
-          <w:sz w:val="32"/>
-          <w:shd w:fill="auto" w:val="clear"/>
-        </w:rPr>
-      </w:pPr>
-    </w:p>
-    <w:p>
-      <w:pPr>
-        <w:widowControl w:val="false"/>
-        <w:suppressAutoHyphens w:val="true"/>
-        <w:spacing w:before="0" w:after="0" w:line="240"/>
-        <w:ind w:right="0" w:left="0" w:firstLine="0"/>
-        <w:jc w:val="center"/>
-        <w:rPr>
-          <w:rFonts w:ascii="Times New Roman" w:hAnsi="Times New Roman" w:cs="Times New Roman" w:eastAsia="Times New Roman"/>
-          <w:color w:val="auto"/>
-          <w:spacing w:val="0"/>
-          <w:position w:val="0"/>
-          <w:sz w:val="32"/>
-          <w:shd w:fill="auto" w:val="clear"/>
-        </w:rPr>
-      </w:pPr>
-    </w:p>
-    <w:p>
-      <w:pPr>
-        <w:widowControl w:val="false"/>
-        <w:suppressAutoHyphens w:val="true"/>
-        <w:spacing w:before="0" w:after="0" w:line="240"/>
-        <w:ind w:right="0" w:left="0" w:firstLine="0"/>
-        <w:jc w:val="center"/>
-        <w:rPr>
-          <w:rFonts w:ascii="Times New Roman" w:hAnsi="Times New Roman" w:cs="Times New Roman" w:eastAsia="Times New Roman"/>
-          <w:color w:val="auto"/>
-          <w:spacing w:val="0"/>
-          <w:position w:val="0"/>
-          <w:sz w:val="32"/>
-          <w:shd w:fill="auto" w:val="clear"/>
-        </w:rPr>
-      </w:pPr>
-    </w:p>
-    <w:p>
-      <w:pPr>
-        <w:widowControl w:val="false"/>
-        <w:suppressAutoHyphens w:val="true"/>
-        <w:spacing w:before="0" w:after="0" w:line="240"/>
-        <w:ind w:right="0" w:left="0" w:firstLine="0"/>
-        <w:jc w:val="center"/>
-        <w:rPr>
-          <w:rFonts w:ascii="Times New Roman" w:hAnsi="Times New Roman" w:cs="Times New Roman" w:eastAsia="Times New Roman"/>
-          <w:color w:val="auto"/>
-          <w:spacing w:val="0"/>
-          <w:position w:val="0"/>
-          <w:sz w:val="32"/>
-          <w:shd w:fill="auto" w:val="clear"/>
-        </w:rPr>
-      </w:pPr>
-    </w:p>
-    <w:p>
-      <w:pPr>
-        <w:widowControl w:val="false"/>
-        <w:suppressAutoHyphens w:val="true"/>
-        <w:spacing w:before="0" w:after="0" w:line="240"/>
-        <w:ind w:right="0" w:left="0" w:firstLine="0"/>
-        <w:jc w:val="center"/>
-        <w:rPr>
-          <w:rFonts w:ascii="Times New Roman" w:hAnsi="Times New Roman" w:cs="Times New Roman" w:eastAsia="Times New Roman"/>
-          <w:color w:val="auto"/>
-          <w:spacing w:val="0"/>
-          <w:position w:val="0"/>
-          <w:sz w:val="32"/>
-          <w:shd w:fill="auto" w:val="clear"/>
-        </w:rPr>
-      </w:pPr>
-    </w:p>
-    <w:p>
-      <w:pPr>
-        <w:widowControl w:val="false"/>
-        <w:suppressAutoHyphens w:val="true"/>
-        <w:spacing w:before="0" w:after="0" w:line="240"/>
-        <w:ind w:right="0" w:left="0" w:firstLine="0"/>
-        <w:jc w:val="center"/>
-        <w:rPr>
-          <w:rFonts w:ascii="Times New Roman" w:hAnsi="Times New Roman" w:cs="Times New Roman" w:eastAsia="Times New Roman"/>
-          <w:color w:val="auto"/>
-          <w:spacing w:val="0"/>
-          <w:position w:val="0"/>
-          <w:sz w:val="32"/>
-          <w:shd w:fill="auto" w:val="clear"/>
-        </w:rPr>
-      </w:pPr>
-    </w:p>
-    <w:p>
-      <w:pPr>
-        <w:widowControl w:val="false"/>
-        <w:suppressAutoHyphens w:val="true"/>
-        <w:spacing w:before="0" w:after="0" w:line="240"/>
-        <w:ind w:right="0" w:left="0" w:firstLine="0"/>
-        <w:jc w:val="center"/>
-        <w:rPr>
-          <w:rFonts w:ascii="Times New Roman" w:hAnsi="Times New Roman" w:cs="Times New Roman" w:eastAsia="Times New Roman"/>
-          <w:color w:val="auto"/>
-          <w:spacing w:val="0"/>
-          <w:position w:val="0"/>
-          <w:sz w:val="32"/>
-          <w:shd w:fill="auto" w:val="clear"/>
-        </w:rPr>
-      </w:pPr>
-    </w:p>
-    <w:p>
-      <w:pPr>
-        <w:widowControl w:val="false"/>
-        <w:suppressAutoHyphens w:val="true"/>
-        <w:spacing w:before="0" w:after="0" w:line="240"/>
-        <w:ind w:right="0" w:left="0" w:firstLine="0"/>
-        <w:jc w:val="center"/>
-        <w:rPr>
-          <w:rFonts w:ascii="Times New Roman" w:hAnsi="Times New Roman" w:cs="Times New Roman" w:eastAsia="Times New Roman"/>
-          <w:color w:val="auto"/>
-          <w:spacing w:val="0"/>
-          <w:position w:val="0"/>
-          <w:sz w:val="32"/>
-          <w:shd w:fill="auto" w:val="clear"/>
-        </w:rPr>
-      </w:pPr>
-    </w:p>
-    <w:p>
-      <w:pPr>
-        <w:widowControl w:val="false"/>
-        <w:suppressAutoHyphens w:val="true"/>
-        <w:spacing w:before="0" w:after="0" w:line="240"/>
-        <w:ind w:right="0" w:left="0" w:firstLine="0"/>
-        <w:jc w:val="center"/>
-        <w:rPr>
-          <w:rFonts w:ascii="Times New Roman" w:hAnsi="Times New Roman" w:cs="Times New Roman" w:eastAsia="Times New Roman"/>
-          <w:color w:val="auto"/>
-          <w:spacing w:val="0"/>
-          <w:position w:val="0"/>
-          <w:sz w:val="32"/>
-          <w:shd w:fill="auto" w:val="clear"/>
-        </w:rPr>
-      </w:pPr>
-    </w:p>
-    <w:p>
-      <w:pPr>
-        <w:widowControl w:val="false"/>
+        <w:suppressAutoHyphens w:val="true"/>
+        <w:spacing w:before="0" w:after="0" w:line="240"/>
+        <w:ind w:right="0" w:left="0" w:firstLine="0"/>
+        <w:jc w:val="center"/>
+        <w:rPr>
+          <w:rFonts w:ascii="Times New Roman" w:hAnsi="Times New Roman" w:cs="Times New Roman" w:eastAsia="Times New Roman"/>
+          <w:color w:val="auto"/>
+          <w:spacing w:val="0"/>
+          <w:position w:val="0"/>
+          <w:sz w:val="32"/>
+          <w:shd w:fill="auto" w:val="clear"/>
+        </w:rPr>
+      </w:pPr>
+    </w:p>
+    <w:p>
+      <w:pPr>
+        <w:suppressAutoHyphens w:val="true"/>
+        <w:spacing w:before="0" w:after="0" w:line="240"/>
+        <w:ind w:right="0" w:left="0" w:firstLine="0"/>
+        <w:jc w:val="center"/>
+        <w:rPr>
+          <w:rFonts w:ascii="Times New Roman" w:hAnsi="Times New Roman" w:cs="Times New Roman" w:eastAsia="Times New Roman"/>
+          <w:color w:val="auto"/>
+          <w:spacing w:val="0"/>
+          <w:position w:val="0"/>
+          <w:sz w:val="32"/>
+          <w:shd w:fill="auto" w:val="clear"/>
+        </w:rPr>
+      </w:pPr>
+    </w:p>
+    <w:p>
+      <w:pPr>
+        <w:suppressAutoHyphens w:val="true"/>
+        <w:spacing w:before="0" w:after="0" w:line="240"/>
+        <w:ind w:right="0" w:left="0" w:firstLine="0"/>
+        <w:jc w:val="center"/>
+        <w:rPr>
+          <w:rFonts w:ascii="Times New Roman" w:hAnsi="Times New Roman" w:cs="Times New Roman" w:eastAsia="Times New Roman"/>
+          <w:color w:val="auto"/>
+          <w:spacing w:val="0"/>
+          <w:position w:val="0"/>
+          <w:sz w:val="32"/>
+          <w:shd w:fill="auto" w:val="clear"/>
+        </w:rPr>
+      </w:pPr>
+    </w:p>
+    <w:p>
+      <w:pPr>
+        <w:suppressAutoHyphens w:val="true"/>
+        <w:spacing w:before="0" w:after="0" w:line="240"/>
+        <w:ind w:right="0" w:left="0" w:firstLine="0"/>
+        <w:jc w:val="center"/>
+        <w:rPr>
+          <w:rFonts w:ascii="Times New Roman" w:hAnsi="Times New Roman" w:cs="Times New Roman" w:eastAsia="Times New Roman"/>
+          <w:color w:val="auto"/>
+          <w:spacing w:val="0"/>
+          <w:position w:val="0"/>
+          <w:sz w:val="32"/>
+          <w:shd w:fill="auto" w:val="clear"/>
+        </w:rPr>
+      </w:pPr>
+    </w:p>
+    <w:p>
+      <w:pPr>
+        <w:suppressAutoHyphens w:val="true"/>
+        <w:spacing w:before="0" w:after="0" w:line="240"/>
+        <w:ind w:right="0" w:left="0" w:firstLine="0"/>
+        <w:jc w:val="center"/>
+        <w:rPr>
+          <w:rFonts w:ascii="Times New Roman" w:hAnsi="Times New Roman" w:cs="Times New Roman" w:eastAsia="Times New Roman"/>
+          <w:color w:val="auto"/>
+          <w:spacing w:val="0"/>
+          <w:position w:val="0"/>
+          <w:sz w:val="32"/>
+          <w:shd w:fill="auto" w:val="clear"/>
+        </w:rPr>
+      </w:pPr>
+    </w:p>
+    <w:p>
+      <w:pPr>
+        <w:suppressAutoHyphens w:val="true"/>
+        <w:spacing w:before="0" w:after="0" w:line="240"/>
+        <w:ind w:right="0" w:left="0" w:firstLine="0"/>
+        <w:jc w:val="center"/>
+        <w:rPr>
+          <w:rFonts w:ascii="Times New Roman" w:hAnsi="Times New Roman" w:cs="Times New Roman" w:eastAsia="Times New Roman"/>
+          <w:color w:val="auto"/>
+          <w:spacing w:val="0"/>
+          <w:position w:val="0"/>
+          <w:sz w:val="32"/>
+          <w:shd w:fill="auto" w:val="clear"/>
+        </w:rPr>
+      </w:pPr>
+    </w:p>
+    <w:p>
+      <w:pPr>
+        <w:suppressAutoHyphens w:val="true"/>
+        <w:spacing w:before="0" w:after="0" w:line="240"/>
+        <w:ind w:right="0" w:left="0" w:firstLine="0"/>
+        <w:jc w:val="center"/>
+        <w:rPr>
+          <w:rFonts w:ascii="Times New Roman" w:hAnsi="Times New Roman" w:cs="Times New Roman" w:eastAsia="Times New Roman"/>
+          <w:color w:val="auto"/>
+          <w:spacing w:val="0"/>
+          <w:position w:val="0"/>
+          <w:sz w:val="32"/>
+          <w:shd w:fill="auto" w:val="clear"/>
+        </w:rPr>
+      </w:pPr>
+    </w:p>
+    <w:p>
+      <w:pPr>
+        <w:suppressAutoHyphens w:val="true"/>
+        <w:spacing w:before="0" w:after="0" w:line="240"/>
+        <w:ind w:right="0" w:left="0" w:firstLine="0"/>
+        <w:jc w:val="center"/>
+        <w:rPr>
+          <w:rFonts w:ascii="Times New Roman" w:hAnsi="Times New Roman" w:cs="Times New Roman" w:eastAsia="Times New Roman"/>
+          <w:color w:val="auto"/>
+          <w:spacing w:val="0"/>
+          <w:position w:val="0"/>
+          <w:sz w:val="32"/>
+          <w:shd w:fill="auto" w:val="clear"/>
+        </w:rPr>
+      </w:pPr>
+    </w:p>
+    <w:p>
+      <w:pPr>
+        <w:suppressAutoHyphens w:val="true"/>
+        <w:spacing w:before="0" w:after="0" w:line="240"/>
+        <w:ind w:right="0" w:left="0" w:firstLine="0"/>
+        <w:jc w:val="center"/>
+        <w:rPr>
+          <w:rFonts w:ascii="Times New Roman" w:hAnsi="Times New Roman" w:cs="Times New Roman" w:eastAsia="Times New Roman"/>
+          <w:color w:val="auto"/>
+          <w:spacing w:val="0"/>
+          <w:position w:val="0"/>
+          <w:sz w:val="32"/>
+          <w:shd w:fill="auto" w:val="clear"/>
+        </w:rPr>
+      </w:pPr>
+    </w:p>
+    <w:p>
+      <w:pPr>
+        <w:suppressAutoHyphens w:val="true"/>
+        <w:spacing w:before="0" w:after="0" w:line="240"/>
+        <w:ind w:right="0" w:left="0" w:firstLine="0"/>
+        <w:jc w:val="center"/>
+        <w:rPr>
+          <w:rFonts w:ascii="Times New Roman" w:hAnsi="Times New Roman" w:cs="Times New Roman" w:eastAsia="Times New Roman"/>
+          <w:color w:val="auto"/>
+          <w:spacing w:val="0"/>
+          <w:position w:val="0"/>
+          <w:sz w:val="32"/>
+          <w:shd w:fill="auto" w:val="clear"/>
+        </w:rPr>
+      </w:pPr>
+    </w:p>
+    <w:p>
+      <w:pPr>
+        <w:suppressAutoHyphens w:val="true"/>
+        <w:spacing w:before="0" w:after="0" w:line="240"/>
+        <w:ind w:right="0" w:left="0" w:firstLine="0"/>
+        <w:jc w:val="center"/>
+        <w:rPr>
+          <w:rFonts w:ascii="Times New Roman" w:hAnsi="Times New Roman" w:cs="Times New Roman" w:eastAsia="Times New Roman"/>
+          <w:color w:val="auto"/>
+          <w:spacing w:val="0"/>
+          <w:position w:val="0"/>
+          <w:sz w:val="32"/>
+          <w:shd w:fill="auto" w:val="clear"/>
+        </w:rPr>
+      </w:pPr>
+    </w:p>
+    <w:p>
+      <w:pPr>
         <w:suppressAutoHyphens w:val="true"/>
         <w:spacing w:before="0" w:after="0" w:line="240"/>
         <w:ind w:right="0" w:left="0" w:firstLine="0"/>
@@ -329,7 +314,6 @@
     </w:p>
     <w:p>
       <w:pPr>
-        <w:widowControl w:val="false"/>
         <w:suppressAutoHyphens w:val="true"/>
         <w:spacing w:before="0" w:after="0" w:line="240"/>
         <w:ind w:right="0" w:left="0" w:firstLine="0"/>
@@ -409,195 +393,183 @@
     </w:p>
     <w:p>
       <w:pPr>
-        <w:widowControl w:val="false"/>
-        <w:suppressAutoHyphens w:val="true"/>
-        <w:spacing w:before="0" w:after="0" w:line="240"/>
-        <w:ind w:right="0" w:left="0" w:firstLine="0"/>
-        <w:jc w:val="center"/>
-        <w:rPr>
-          <w:rFonts w:ascii="Times New Roman" w:hAnsi="Times New Roman" w:cs="Times New Roman" w:eastAsia="Times New Roman"/>
-          <w:b/>
-          <w:color w:val="auto"/>
-          <w:spacing w:val="0"/>
-          <w:position w:val="0"/>
-          <w:sz w:val="32"/>
-          <w:shd w:fill="auto" w:val="clear"/>
-        </w:rPr>
-      </w:pPr>
-    </w:p>
-    <w:p>
-      <w:pPr>
-        <w:widowControl w:val="false"/>
-        <w:suppressAutoHyphens w:val="true"/>
-        <w:spacing w:before="0" w:after="0" w:line="240"/>
-        <w:ind w:right="0" w:left="0" w:firstLine="0"/>
-        <w:jc w:val="center"/>
-        <w:rPr>
-          <w:rFonts w:ascii="Times New Roman" w:hAnsi="Times New Roman" w:cs="Times New Roman" w:eastAsia="Times New Roman"/>
-          <w:color w:val="auto"/>
-          <w:spacing w:val="0"/>
-          <w:position w:val="0"/>
-          <w:sz w:val="32"/>
-          <w:shd w:fill="auto" w:val="clear"/>
-        </w:rPr>
-      </w:pPr>
-    </w:p>
-    <w:p>
-      <w:pPr>
-        <w:widowControl w:val="false"/>
-        <w:suppressAutoHyphens w:val="true"/>
-        <w:spacing w:before="0" w:after="0" w:line="240"/>
-        <w:ind w:right="0" w:left="0" w:firstLine="0"/>
-        <w:jc w:val="center"/>
-        <w:rPr>
-          <w:rFonts w:ascii="Times New Roman" w:hAnsi="Times New Roman" w:cs="Times New Roman" w:eastAsia="Times New Roman"/>
-          <w:color w:val="auto"/>
-          <w:spacing w:val="0"/>
-          <w:position w:val="0"/>
-          <w:sz w:val="32"/>
-          <w:shd w:fill="auto" w:val="clear"/>
-        </w:rPr>
-      </w:pPr>
-    </w:p>
-    <w:p>
-      <w:pPr>
-        <w:widowControl w:val="false"/>
-        <w:suppressAutoHyphens w:val="true"/>
-        <w:spacing w:before="0" w:after="0" w:line="240"/>
-        <w:ind w:right="0" w:left="0" w:firstLine="0"/>
-        <w:jc w:val="center"/>
-        <w:rPr>
-          <w:rFonts w:ascii="Times New Roman" w:hAnsi="Times New Roman" w:cs="Times New Roman" w:eastAsia="Times New Roman"/>
-          <w:color w:val="auto"/>
-          <w:spacing w:val="0"/>
-          <w:position w:val="0"/>
-          <w:sz w:val="32"/>
-          <w:shd w:fill="auto" w:val="clear"/>
-        </w:rPr>
-      </w:pPr>
-    </w:p>
-    <w:p>
-      <w:pPr>
-        <w:widowControl w:val="false"/>
-        <w:suppressAutoHyphens w:val="true"/>
-        <w:spacing w:before="0" w:after="0" w:line="240"/>
-        <w:ind w:right="0" w:left="0" w:firstLine="0"/>
-        <w:jc w:val="center"/>
-        <w:rPr>
-          <w:rFonts w:ascii="Times New Roman" w:hAnsi="Times New Roman" w:cs="Times New Roman" w:eastAsia="Times New Roman"/>
-          <w:color w:val="auto"/>
-          <w:spacing w:val="0"/>
-          <w:position w:val="0"/>
-          <w:sz w:val="32"/>
-          <w:shd w:fill="auto" w:val="clear"/>
-        </w:rPr>
-      </w:pPr>
-    </w:p>
-    <w:p>
-      <w:pPr>
-        <w:widowControl w:val="false"/>
-        <w:suppressAutoHyphens w:val="true"/>
-        <w:spacing w:before="0" w:after="0" w:line="240"/>
-        <w:ind w:right="0" w:left="0" w:firstLine="0"/>
-        <w:jc w:val="center"/>
-        <w:rPr>
-          <w:rFonts w:ascii="Times New Roman" w:hAnsi="Times New Roman" w:cs="Times New Roman" w:eastAsia="Times New Roman"/>
-          <w:color w:val="auto"/>
-          <w:spacing w:val="0"/>
-          <w:position w:val="0"/>
-          <w:sz w:val="32"/>
-          <w:shd w:fill="auto" w:val="clear"/>
-        </w:rPr>
-      </w:pPr>
-    </w:p>
-    <w:p>
-      <w:pPr>
-        <w:widowControl w:val="false"/>
-        <w:suppressAutoHyphens w:val="true"/>
-        <w:spacing w:before="0" w:after="0" w:line="240"/>
-        <w:ind w:right="0" w:left="0" w:firstLine="0"/>
-        <w:jc w:val="center"/>
-        <w:rPr>
-          <w:rFonts w:ascii="Times New Roman" w:hAnsi="Times New Roman" w:cs="Times New Roman" w:eastAsia="Times New Roman"/>
-          <w:color w:val="auto"/>
-          <w:spacing w:val="0"/>
-          <w:position w:val="0"/>
-          <w:sz w:val="32"/>
-          <w:shd w:fill="auto" w:val="clear"/>
-        </w:rPr>
-      </w:pPr>
-    </w:p>
-    <w:p>
-      <w:pPr>
-        <w:widowControl w:val="false"/>
-        <w:suppressAutoHyphens w:val="true"/>
-        <w:spacing w:before="0" w:after="0" w:line="240"/>
-        <w:ind w:right="0" w:left="0" w:firstLine="0"/>
-        <w:jc w:val="center"/>
-        <w:rPr>
-          <w:rFonts w:ascii="Times New Roman" w:hAnsi="Times New Roman" w:cs="Times New Roman" w:eastAsia="Times New Roman"/>
-          <w:color w:val="auto"/>
-          <w:spacing w:val="0"/>
-          <w:position w:val="0"/>
-          <w:sz w:val="32"/>
-          <w:shd w:fill="auto" w:val="clear"/>
-        </w:rPr>
-      </w:pPr>
-    </w:p>
-    <w:p>
-      <w:pPr>
-        <w:widowControl w:val="false"/>
-        <w:suppressAutoHyphens w:val="true"/>
-        <w:spacing w:before="0" w:after="0" w:line="240"/>
-        <w:ind w:right="0" w:left="0" w:firstLine="0"/>
-        <w:jc w:val="center"/>
-        <w:rPr>
-          <w:rFonts w:ascii="Times New Roman" w:hAnsi="Times New Roman" w:cs="Times New Roman" w:eastAsia="Times New Roman"/>
-          <w:color w:val="auto"/>
-          <w:spacing w:val="0"/>
-          <w:position w:val="0"/>
-          <w:sz w:val="32"/>
-          <w:shd w:fill="auto" w:val="clear"/>
-        </w:rPr>
-      </w:pPr>
-    </w:p>
-    <w:p>
-      <w:pPr>
-        <w:widowControl w:val="false"/>
-        <w:suppressAutoHyphens w:val="true"/>
-        <w:spacing w:before="0" w:after="0" w:line="240"/>
-        <w:ind w:right="0" w:left="0" w:firstLine="0"/>
-        <w:jc w:val="center"/>
-        <w:rPr>
-          <w:rFonts w:ascii="Times New Roman" w:hAnsi="Times New Roman" w:cs="Times New Roman" w:eastAsia="Times New Roman"/>
-          <w:color w:val="auto"/>
-          <w:spacing w:val="0"/>
-          <w:position w:val="0"/>
-          <w:sz w:val="32"/>
-          <w:shd w:fill="auto" w:val="clear"/>
-        </w:rPr>
-      </w:pPr>
-    </w:p>
-    <w:p>
-      <w:pPr>
-        <w:widowControl w:val="false"/>
-        <w:suppressAutoHyphens w:val="true"/>
-        <w:spacing w:before="0" w:after="0" w:line="240"/>
-        <w:ind w:right="0" w:left="0" w:firstLine="0"/>
-        <w:jc w:val="center"/>
-        <w:rPr>
-          <w:rFonts w:ascii="Times New Roman" w:hAnsi="Times New Roman" w:cs="Times New Roman" w:eastAsia="Times New Roman"/>
-          <w:color w:val="auto"/>
-          <w:spacing w:val="0"/>
-          <w:position w:val="0"/>
-          <w:sz w:val="32"/>
-          <w:shd w:fill="auto" w:val="clear"/>
-        </w:rPr>
-      </w:pPr>
-    </w:p>
-    <w:p>
-      <w:pPr>
-        <w:widowControl w:val="false"/>
+        <w:suppressAutoHyphens w:val="true"/>
+        <w:spacing w:before="0" w:after="0" w:line="240"/>
+        <w:ind w:right="0" w:left="0" w:firstLine="0"/>
+        <w:jc w:val="center"/>
+        <w:rPr>
+          <w:rFonts w:ascii="Times New Roman" w:hAnsi="Times New Roman" w:cs="Times New Roman" w:eastAsia="Times New Roman"/>
+          <w:b/>
+          <w:color w:val="auto"/>
+          <w:spacing w:val="0"/>
+          <w:position w:val="0"/>
+          <w:sz w:val="32"/>
+          <w:shd w:fill="auto" w:val="clear"/>
+        </w:rPr>
+      </w:pPr>
+    </w:p>
+    <w:p>
+      <w:pPr>
+        <w:suppressAutoHyphens w:val="true"/>
+        <w:spacing w:before="0" w:after="0" w:line="240"/>
+        <w:ind w:right="0" w:left="0" w:firstLine="0"/>
+        <w:jc w:val="center"/>
+        <w:rPr>
+          <w:rFonts w:ascii="Times New Roman" w:hAnsi="Times New Roman" w:cs="Times New Roman" w:eastAsia="Times New Roman"/>
+          <w:color w:val="auto"/>
+          <w:spacing w:val="0"/>
+          <w:position w:val="0"/>
+          <w:sz w:val="32"/>
+          <w:shd w:fill="auto" w:val="clear"/>
+        </w:rPr>
+      </w:pPr>
+    </w:p>
+    <w:p>
+      <w:pPr>
+        <w:suppressAutoHyphens w:val="true"/>
+        <w:spacing w:before="0" w:after="0" w:line="240"/>
+        <w:ind w:right="0" w:left="0" w:firstLine="0"/>
+        <w:jc w:val="center"/>
+        <w:rPr>
+          <w:rFonts w:ascii="Times New Roman" w:hAnsi="Times New Roman" w:cs="Times New Roman" w:eastAsia="Times New Roman"/>
+          <w:color w:val="auto"/>
+          <w:spacing w:val="0"/>
+          <w:position w:val="0"/>
+          <w:sz w:val="32"/>
+          <w:shd w:fill="auto" w:val="clear"/>
+        </w:rPr>
+      </w:pPr>
+    </w:p>
+    <w:p>
+      <w:pPr>
+        <w:suppressAutoHyphens w:val="true"/>
+        <w:spacing w:before="0" w:after="0" w:line="240"/>
+        <w:ind w:right="0" w:left="0" w:firstLine="0"/>
+        <w:jc w:val="center"/>
+        <w:rPr>
+          <w:rFonts w:ascii="Times New Roman" w:hAnsi="Times New Roman" w:cs="Times New Roman" w:eastAsia="Times New Roman"/>
+          <w:color w:val="auto"/>
+          <w:spacing w:val="0"/>
+          <w:position w:val="0"/>
+          <w:sz w:val="32"/>
+          <w:shd w:fill="auto" w:val="clear"/>
+        </w:rPr>
+      </w:pPr>
+    </w:p>
+    <w:p>
+      <w:pPr>
+        <w:suppressAutoHyphens w:val="true"/>
+        <w:spacing w:before="0" w:after="0" w:line="240"/>
+        <w:ind w:right="0" w:left="0" w:firstLine="0"/>
+        <w:jc w:val="center"/>
+        <w:rPr>
+          <w:rFonts w:ascii="Times New Roman" w:hAnsi="Times New Roman" w:cs="Times New Roman" w:eastAsia="Times New Roman"/>
+          <w:color w:val="auto"/>
+          <w:spacing w:val="0"/>
+          <w:position w:val="0"/>
+          <w:sz w:val="32"/>
+          <w:shd w:fill="auto" w:val="clear"/>
+        </w:rPr>
+      </w:pPr>
+    </w:p>
+    <w:p>
+      <w:pPr>
+        <w:suppressAutoHyphens w:val="true"/>
+        <w:spacing w:before="0" w:after="0" w:line="240"/>
+        <w:ind w:right="0" w:left="0" w:firstLine="0"/>
+        <w:jc w:val="center"/>
+        <w:rPr>
+          <w:rFonts w:ascii="Times New Roman" w:hAnsi="Times New Roman" w:cs="Times New Roman" w:eastAsia="Times New Roman"/>
+          <w:color w:val="auto"/>
+          <w:spacing w:val="0"/>
+          <w:position w:val="0"/>
+          <w:sz w:val="32"/>
+          <w:shd w:fill="auto" w:val="clear"/>
+        </w:rPr>
+      </w:pPr>
+    </w:p>
+    <w:p>
+      <w:pPr>
+        <w:suppressAutoHyphens w:val="true"/>
+        <w:spacing w:before="0" w:after="0" w:line="240"/>
+        <w:ind w:right="0" w:left="0" w:firstLine="0"/>
+        <w:jc w:val="center"/>
+        <w:rPr>
+          <w:rFonts w:ascii="Times New Roman" w:hAnsi="Times New Roman" w:cs="Times New Roman" w:eastAsia="Times New Roman"/>
+          <w:color w:val="auto"/>
+          <w:spacing w:val="0"/>
+          <w:position w:val="0"/>
+          <w:sz w:val="32"/>
+          <w:shd w:fill="auto" w:val="clear"/>
+        </w:rPr>
+      </w:pPr>
+    </w:p>
+    <w:p>
+      <w:pPr>
+        <w:suppressAutoHyphens w:val="true"/>
+        <w:spacing w:before="0" w:after="0" w:line="240"/>
+        <w:ind w:right="0" w:left="0" w:firstLine="0"/>
+        <w:jc w:val="center"/>
+        <w:rPr>
+          <w:rFonts w:ascii="Times New Roman" w:hAnsi="Times New Roman" w:cs="Times New Roman" w:eastAsia="Times New Roman"/>
+          <w:color w:val="auto"/>
+          <w:spacing w:val="0"/>
+          <w:position w:val="0"/>
+          <w:sz w:val="32"/>
+          <w:shd w:fill="auto" w:val="clear"/>
+        </w:rPr>
+      </w:pPr>
+    </w:p>
+    <w:p>
+      <w:pPr>
+        <w:suppressAutoHyphens w:val="true"/>
+        <w:spacing w:before="0" w:after="0" w:line="240"/>
+        <w:ind w:right="0" w:left="0" w:firstLine="0"/>
+        <w:jc w:val="center"/>
+        <w:rPr>
+          <w:rFonts w:ascii="Times New Roman" w:hAnsi="Times New Roman" w:cs="Times New Roman" w:eastAsia="Times New Roman"/>
+          <w:color w:val="auto"/>
+          <w:spacing w:val="0"/>
+          <w:position w:val="0"/>
+          <w:sz w:val="32"/>
+          <w:shd w:fill="auto" w:val="clear"/>
+        </w:rPr>
+      </w:pPr>
+    </w:p>
+    <w:p>
+      <w:pPr>
+        <w:suppressAutoHyphens w:val="true"/>
+        <w:spacing w:before="0" w:after="0" w:line="240"/>
+        <w:ind w:right="0" w:left="0" w:firstLine="0"/>
+        <w:jc w:val="center"/>
+        <w:rPr>
+          <w:rFonts w:ascii="Times New Roman" w:hAnsi="Times New Roman" w:cs="Times New Roman" w:eastAsia="Times New Roman"/>
+          <w:color w:val="auto"/>
+          <w:spacing w:val="0"/>
+          <w:position w:val="0"/>
+          <w:sz w:val="32"/>
+          <w:shd w:fill="auto" w:val="clear"/>
+        </w:rPr>
+      </w:pPr>
+    </w:p>
+    <w:p>
+      <w:pPr>
+        <w:suppressAutoHyphens w:val="true"/>
+        <w:spacing w:before="0" w:after="0" w:line="240"/>
+        <w:ind w:right="0" w:left="0" w:firstLine="0"/>
+        <w:jc w:val="center"/>
+        <w:rPr>
+          <w:rFonts w:ascii="Times New Roman" w:hAnsi="Times New Roman" w:cs="Times New Roman" w:eastAsia="Times New Roman"/>
+          <w:color w:val="auto"/>
+          <w:spacing w:val="0"/>
+          <w:position w:val="0"/>
+          <w:sz w:val="32"/>
+          <w:shd w:fill="auto" w:val="clear"/>
+        </w:rPr>
+      </w:pPr>
+    </w:p>
+    <w:p>
+      <w:pPr>
         <w:suppressAutoHyphens w:val="true"/>
         <w:spacing w:before="0" w:after="0" w:line="240"/>
         <w:ind w:right="0" w:left="0" w:firstLine="0"/>
@@ -620,34 +592,11 @@
           <w:sz w:val="32"/>
           <w:shd w:fill="auto" w:val="clear"/>
         </w:rPr>
-        <w:t xml:space="preserve">Выполнил: </w:t>
-      </w:r>
-      <w:r>
-        <w:rPr>
-          <w:rFonts w:ascii="Times New Roman" w:hAnsi="Times New Roman" w:cs="Times New Roman" w:eastAsia="Times New Roman"/>
-          <w:color w:val="auto"/>
-          <w:spacing w:val="0"/>
-          <w:position w:val="0"/>
-          <w:sz w:val="32"/>
-          <w:shd w:fill="auto" w:val="clear"/>
-        </w:rPr>
-        <w:t xml:space="preserve">Stepan Cascaval</w:t>
-      </w:r>
-      <w:r>
-        <w:rPr>
-          <w:rFonts w:ascii="Times New Roman" w:hAnsi="Times New Roman" w:cs="Times New Roman" w:eastAsia="Times New Roman"/>
-          <w:color w:val="auto"/>
-          <w:spacing w:val="0"/>
-          <w:position w:val="0"/>
-          <w:sz w:val="32"/>
-          <w:shd w:fill="auto" w:val="clear"/>
-        </w:rPr>
-        <w:t xml:space="preserve">, </w:t>
-      </w:r>
-    </w:p>
-    <w:p>
-      <w:pPr>
-        <w:widowControl w:val="false"/>
+        <w:t xml:space="preserve">Выполнил: Stepan Cascaval, </w:t>
+      </w:r>
+    </w:p>
+    <w:p>
+      <w:pPr>
         <w:suppressAutoHyphens w:val="true"/>
         <w:spacing w:before="0" w:after="0" w:line="240"/>
         <w:ind w:right="0" w:left="0" w:firstLine="0"/>
@@ -675,7 +624,6 @@
     </w:p>
     <w:p>
       <w:pPr>
-        <w:widowControl w:val="false"/>
         <w:suppressAutoHyphens w:val="true"/>
         <w:spacing w:before="0" w:after="0" w:line="240"/>
         <w:ind w:right="0" w:left="0" w:firstLine="0"/>
@@ -698,34 +646,11 @@
           <w:sz w:val="32"/>
           <w:shd w:fill="FFFFFF" w:val="clear"/>
         </w:rPr>
-        <w:t xml:space="preserve">Проверила: N</w:t>
-      </w:r>
-      <w:r>
-        <w:rPr>
-          <w:rFonts w:ascii="Times New Roman" w:hAnsi="Times New Roman" w:cs="Times New Roman" w:eastAsia="Times New Roman"/>
-          <w:color w:val="000000"/>
-          <w:spacing w:val="0"/>
-          <w:position w:val="0"/>
-          <w:sz w:val="32"/>
-          <w:shd w:fill="FFFFFF" w:val="clear"/>
-        </w:rPr>
-        <w:t xml:space="preserve">atalia </w:t>
-      </w:r>
-      <w:r>
-        <w:rPr>
-          <w:rFonts w:ascii="Times New Roman" w:hAnsi="Times New Roman" w:cs="Times New Roman" w:eastAsia="Times New Roman"/>
-          <w:color w:val="000000"/>
-          <w:spacing w:val="0"/>
-          <w:position w:val="0"/>
-          <w:sz w:val="32"/>
-          <w:shd w:fill="FFFFFF" w:val="clear"/>
-        </w:rPr>
-        <w:t xml:space="preserve">Cuciuc,</w:t>
-      </w:r>
-    </w:p>
-    <w:p>
-      <w:pPr>
-        <w:widowControl w:val="false"/>
+        <w:t xml:space="preserve">Проверила: Natalia Cuciuc,</w:t>
+      </w:r>
+    </w:p>
+    <w:p>
+      <w:pPr>
         <w:suppressAutoHyphens w:val="true"/>
         <w:spacing w:before="0" w:after="0" w:line="240"/>
         <w:ind w:right="0" w:left="0" w:firstLine="0"/>
@@ -742,7 +667,6 @@
     </w:p>
     <w:p>
       <w:pPr>
-        <w:widowControl w:val="false"/>
         <w:suppressAutoHyphens w:val="true"/>
         <w:spacing w:before="0" w:after="0" w:line="240"/>
         <w:ind w:right="0" w:left="0" w:firstLine="0"/>
@@ -759,7 +683,6 @@
     </w:p>
     <w:p>
       <w:pPr>
-        <w:widowControl w:val="false"/>
         <w:suppressAutoHyphens w:val="true"/>
         <w:spacing w:before="0" w:after="0" w:line="240"/>
         <w:ind w:right="0" w:left="0" w:firstLine="0"/>
@@ -776,41 +699,38 @@
     </w:p>
     <w:p>
       <w:pPr>
-        <w:widowControl w:val="false"/>
-        <w:suppressAutoHyphens w:val="true"/>
-        <w:spacing w:before="0" w:after="0" w:line="240"/>
-        <w:ind w:right="0" w:left="0" w:firstLine="0"/>
-        <w:jc w:val="center"/>
-        <w:rPr>
-          <w:rFonts w:ascii="Times New Roman" w:hAnsi="Times New Roman" w:cs="Times New Roman" w:eastAsia="Times New Roman"/>
-          <w:color w:val="auto"/>
-          <w:spacing w:val="0"/>
-          <w:position w:val="0"/>
-          <w:sz w:val="32"/>
-          <w:shd w:fill="auto" w:val="clear"/>
-        </w:rPr>
-      </w:pPr>
-    </w:p>
-    <w:p>
-      <w:pPr>
-        <w:widowControl w:val="false"/>
-        <w:suppressAutoHyphens w:val="true"/>
-        <w:spacing w:before="0" w:after="0" w:line="240"/>
-        <w:ind w:right="0" w:left="0" w:firstLine="0"/>
-        <w:jc w:val="center"/>
-        <w:rPr>
-          <w:rFonts w:ascii="Times New Roman" w:hAnsi="Times New Roman" w:cs="Times New Roman" w:eastAsia="Times New Roman"/>
-          <w:color w:val="auto"/>
-          <w:spacing w:val="0"/>
-          <w:position w:val="0"/>
-          <w:sz w:val="32"/>
-          <w:shd w:fill="auto" w:val="clear"/>
-        </w:rPr>
-      </w:pPr>
-    </w:p>
-    <w:p>
-      <w:pPr>
-        <w:widowControl w:val="false"/>
+        <w:suppressAutoHyphens w:val="true"/>
+        <w:spacing w:before="0" w:after="0" w:line="240"/>
+        <w:ind w:right="0" w:left="0" w:firstLine="0"/>
+        <w:jc w:val="center"/>
+        <w:rPr>
+          <w:rFonts w:ascii="Times New Roman" w:hAnsi="Times New Roman" w:cs="Times New Roman" w:eastAsia="Times New Roman"/>
+          <w:color w:val="auto"/>
+          <w:spacing w:val="0"/>
+          <w:position w:val="0"/>
+          <w:sz w:val="32"/>
+          <w:shd w:fill="auto" w:val="clear"/>
+        </w:rPr>
+      </w:pPr>
+    </w:p>
+    <w:p>
+      <w:pPr>
+        <w:suppressAutoHyphens w:val="true"/>
+        <w:spacing w:before="0" w:after="0" w:line="240"/>
+        <w:ind w:right="0" w:left="0" w:firstLine="0"/>
+        <w:jc w:val="center"/>
+        <w:rPr>
+          <w:rFonts w:ascii="Times New Roman" w:hAnsi="Times New Roman" w:cs="Times New Roman" w:eastAsia="Times New Roman"/>
+          <w:color w:val="auto"/>
+          <w:spacing w:val="0"/>
+          <w:position w:val="0"/>
+          <w:sz w:val="32"/>
+          <w:shd w:fill="auto" w:val="clear"/>
+        </w:rPr>
+      </w:pPr>
+    </w:p>
+    <w:p>
+      <w:pPr>
         <w:suppressAutoHyphens w:val="true"/>
         <w:spacing w:before="0" w:after="0" w:line="240"/>
         <w:ind w:right="0" w:left="0" w:firstLine="0"/>
@@ -875,12 +795,11 @@
         <w:ind w:right="0" w:left="0" w:firstLine="0"/>
         <w:jc w:val="left"/>
         <w:rPr>
-          <w:rFonts w:ascii="Calibri" w:hAnsi="Calibri" w:cs="Calibri" w:eastAsia="Calibri"/>
-          <w:b/>
-          <w:color w:val="365F91"/>
-          <w:spacing w:val="0"/>
-          <w:position w:val="0"/>
-          <w:sz w:val="28"/>
+          <w:rFonts w:ascii="Arial" w:hAnsi="Arial" w:cs="Arial" w:eastAsia="Arial"/>
+          <w:color w:val="auto"/>
+          <w:spacing w:val="0"/>
+          <w:position w:val="0"/>
+          <w:sz w:val="24"/>
           <w:shd w:fill="auto" w:val="clear"/>
         </w:rPr>
       </w:pPr>
@@ -907,39 +826,13 @@
           <w:shd w:fill="auto" w:val="clear"/>
         </w:rPr>
         <w:t xml:space="preserve">Теоретическая база</w:t>
-      </w:r>
-    </w:p>
-    <w:p>
-      <w:pPr>
-        <w:spacing w:before="0" w:after="120" w:line="276"/>
-        <w:ind w:right="0" w:left="0" w:firstLine="0"/>
-        <w:jc w:val="left"/>
-        <w:rPr>
-          <w:rFonts w:ascii="Arial" w:hAnsi="Arial" w:cs="Arial" w:eastAsia="Arial"/>
-          <w:color w:val="auto"/>
-          <w:spacing w:val="0"/>
-          <w:position w:val="0"/>
-          <w:sz w:val="24"/>
-          <w:shd w:fill="auto" w:val="clear"/>
-        </w:rPr>
-      </w:pPr>
-      <w:r>
-        <w:rPr>
-          <w:rFonts w:ascii="Arial" w:hAnsi="Arial" w:cs="Arial" w:eastAsia="Arial"/>
-          <w:color w:val="auto"/>
-          <w:spacing w:val="0"/>
-          <w:position w:val="0"/>
-          <w:sz w:val="24"/>
-          <w:shd w:fill="auto" w:val="clear"/>
-        </w:rPr>
-        <w:t xml:space="preserve">Согласно учебным материалам:</w:t>
       </w:r>
     </w:p>
     <w:p>
       <w:pPr>
         <w:numPr>
           <w:ilvl w:val="0"/>
-          <w:numId w:val="11"/>
+          <w:numId w:val="10"/>
         </w:numPr>
         <w:tabs>
           <w:tab w:val="left" w:pos="360" w:leader="none"/>
@@ -1017,7 +910,7 @@
       <w:pPr>
         <w:numPr>
           <w:ilvl w:val="0"/>
-          <w:numId w:val="11"/>
+          <w:numId w:val="10"/>
         </w:numPr>
         <w:tabs>
           <w:tab w:val="left" w:pos="360" w:leader="none"/>
@@ -1128,7 +1021,7 @@
       <w:pPr>
         <w:numPr>
           <w:ilvl w:val="0"/>
-          <w:numId w:val="11"/>
+          <w:numId w:val="10"/>
         </w:numPr>
         <w:tabs>
           <w:tab w:val="left" w:pos="360" w:leader="none"/>
@@ -1289,7 +1182,7 @@
       <w:pPr>
         <w:numPr>
           <w:ilvl w:val="0"/>
-          <w:numId w:val="15"/>
+          <w:numId w:val="14"/>
         </w:numPr>
         <w:tabs>
           <w:tab w:val="left" w:pos="360" w:leader="none"/>
@@ -1334,7 +1227,7 @@
       <w:pPr>
         <w:numPr>
           <w:ilvl w:val="0"/>
-          <w:numId w:val="15"/>
+          <w:numId w:val="14"/>
         </w:numPr>
         <w:tabs>
           <w:tab w:val="left" w:pos="360" w:leader="none"/>
@@ -1467,7 +1360,7 @@
       <w:pPr>
         <w:numPr>
           <w:ilvl w:val="0"/>
-          <w:numId w:val="15"/>
+          <w:numId w:val="14"/>
         </w:numPr>
         <w:tabs>
           <w:tab w:val="left" w:pos="360" w:leader="none"/>
@@ -1531,12 +1424,11 @@
         <w:ind w:right="0" w:left="0" w:firstLine="0"/>
         <w:jc w:val="left"/>
         <w:rPr>
-          <w:rFonts w:ascii="Calibri" w:hAnsi="Calibri" w:cs="Calibri" w:eastAsia="Calibri"/>
-          <w:b/>
-          <w:color w:val="365F91"/>
-          <w:spacing w:val="0"/>
-          <w:position w:val="0"/>
-          <w:sz w:val="28"/>
+          <w:rFonts w:ascii="Arial" w:hAnsi="Arial" w:cs="Arial" w:eastAsia="Arial"/>
+          <w:color w:val="auto"/>
+          <w:spacing w:val="0"/>
+          <w:position w:val="0"/>
+          <w:sz w:val="24"/>
           <w:shd w:fill="auto" w:val="clear"/>
         </w:rPr>
       </w:pPr>
@@ -1563,32 +1455,6 @@
           <w:shd w:fill="auto" w:val="clear"/>
         </w:rPr>
         <w:t xml:space="preserve">Реализация на C++</w:t>
-      </w:r>
-    </w:p>
-    <w:p>
-      <w:pPr>
-        <w:spacing w:before="0" w:after="120" w:line="276"/>
-        <w:ind w:right="0" w:left="0" w:firstLine="0"/>
-        <w:jc w:val="left"/>
-        <w:rPr>
-          <w:rFonts w:ascii="Arial" w:hAnsi="Arial" w:cs="Arial" w:eastAsia="Arial"/>
-          <w:color w:val="auto"/>
-          <w:spacing w:val="0"/>
-          <w:position w:val="0"/>
-          <w:sz w:val="24"/>
-          <w:shd w:fill="auto" w:val="clear"/>
-        </w:rPr>
-      </w:pPr>
-      <w:r>
-        <w:rPr>
-          <w:rFonts w:ascii="Arial" w:hAnsi="Arial" w:cs="Arial" w:eastAsia="Arial"/>
-          <w:color w:val="auto"/>
-          <w:spacing w:val="0"/>
-          <w:position w:val="0"/>
-          <w:sz w:val="24"/>
-          <w:shd w:fill="auto" w:val="clear"/>
-        </w:rPr>
-        <w:t xml:space="preserve">Ниже приведён полный исходный код программы:</w:t>
       </w:r>
     </w:p>
     <w:p>
@@ -2082,10 +1948,10 @@
       <w:lvlText w:val="%1."/>
     </w:lvl>
   </w:abstractNum>
-  <w:num w:numId="11">
+  <w:num w:numId="10">
     <w:abstractNumId w:val="0"/>
   </w:num>
-  <w:num w:numId="15">
+  <w:num w:numId="14">
     <w:abstractNumId w:val="1"/>
   </w:num>
 </w:numbering>

</xml_diff>